<commit_message>
docs: remove artificial section page breaks to eliminate large empty gaps and allow continuous flow
</commit_message>
<xml_diff>
--- a/docs/Software_Architecture_Design_Report_AIVES_Group3.docx
+++ b/docs/Software_Architecture_Design_Report_AIVES_Group3.docx
@@ -37,13 +37,6 @@
         </w:rPr>
         <w:t>AIVES — AI-POWERED VIVA EXAMINATION SYSTEM</w:t>
       </w:r>
-    </w:p>
-    <w:p>
-      <w:pPr>
-        <w:rPr>
-          <w:color w:val="000000"/>
-        </w:rPr>
-      </w:pPr>
     </w:p>
     <w:p>
       <w:pPr>
@@ -1384,11 +1377,6 @@
       </w:tr>
     </w:tbl>
     <w:p>
-      <w:r>
-        <w:br w:type="page"/>
-      </w:r>
-    </w:p>
-    <w:p>
       <w:pPr>
         <w:pStyle w:val="Heading1"/>
         <w:spacing w:before="400" w:after="160"/>
@@ -1608,11 +1596,6 @@
       </w:r>
     </w:p>
     <w:p>
-      <w:r>
-        <w:br w:type="page"/>
-      </w:r>
-    </w:p>
-    <w:p>
       <w:pPr>
         <w:pStyle w:val="Heading1"/>
         <w:spacing w:before="400" w:after="160"/>
@@ -1854,11 +1837,6 @@
       </w:r>
       <w:r>
         <w:t>Cụm dịch vụ đám mây chuyên dụng: Azure OpenAI Service cung cấp mô hình GPT-4 xử lý sinh câu hỏi thông minh; Azure Cognitive Services cung cấp Speech-to-Text (STT) nhận dạng giọng nói tiếng Việt và Text-to-Speech (TTS) tổng hợp giọng đọc tự nhiên.</w:t>
-      </w:r>
-    </w:p>
-    <w:p>
-      <w:r>
-        <w:br w:type="page"/>
       </w:r>
     </w:p>
     <w:p>
@@ -3034,11 +3012,6 @@
       </w:tr>
     </w:tbl>
     <w:p>
-      <w:r>
-        <w:br w:type="page"/>
-      </w:r>
-    </w:p>
-    <w:p>
       <w:pPr>
         <w:pStyle w:val="Heading1"/>
         <w:spacing w:before="400" w:after="160"/>
@@ -3546,11 +3519,6 @@
       </w:tr>
     </w:tbl>
     <w:p>
-      <w:r>
-        <w:br w:type="page"/>
-      </w:r>
-    </w:p>
-    <w:p>
       <w:pPr>
         <w:pStyle w:val="Heading1"/>
         <w:spacing w:before="400" w:after="160"/>
@@ -3912,11 +3880,6 @@
       </w:r>
     </w:p>
     <w:p>
-      <w:r>
-        <w:br w:type="page"/>
-      </w:r>
-    </w:p>
-    <w:p>
       <w:pPr>
         <w:pStyle w:val="Heading1"/>
         <w:spacing w:before="400" w:after="160"/>
@@ -4159,11 +4122,6 @@
       </w:r>
       <w:r>
         <w:t>QuestionsController, CoursesController, AuthController, UsersController điều phối giao tiếp HTTP và trả về kết quả chuẩn ActionResult.</w:t>
-      </w:r>
-    </w:p>
-    <w:p>
-      <w:r>
-        <w:br w:type="page"/>
       </w:r>
     </w:p>
     <w:p>
@@ -9467,11 +9425,6 @@
       </w:tr>
     </w:tbl>
     <w:p>
-      <w:r>
-        <w:br w:type="page"/>
-      </w:r>
-    </w:p>
-    <w:p>
       <w:pPr>
         <w:pStyle w:val="Heading1"/>
         <w:spacing w:before="400" w:after="160"/>
@@ -10066,11 +10019,6 @@
       </w:r>
     </w:p>
     <w:p>
-      <w:r>
-        <w:br w:type="page"/>
-      </w:r>
-    </w:p>
-    <w:p>
       <w:pPr>
         <w:pStyle w:val="Heading1"/>
         <w:spacing w:before="400" w:after="160"/>
@@ -10194,11 +10142,6 @@
       </w:pPr>
       <w:r>
         <w:t xml:space="preserve">Toàn bộ RESTful API backend được cung cấp tài liệu tự động qua Swagger UI tại đường dẫn gốc https://localhost:7035/. Hỗ trợ nút Authorize cho phép dán JWT Bearer Token để kiểm thử trực tiếp các API bảo mật.</w:t>
-      </w:r>
-    </w:p>
-    <w:p>
-      <w:r>
-        <w:br w:type="page"/>
       </w:r>
     </w:p>
     <w:p>
@@ -11425,11 +11368,6 @@
       </w:r>
     </w:p>
     <w:p>
-      <w:r>
-        <w:br w:type="page"/>
-      </w:r>
-    </w:p>
-    <w:p>
       <w:pPr>
         <w:pStyle w:val="Heading1"/>
         <w:spacing w:before="400" w:after="160"/>
@@ -11610,11 +11548,6 @@
       </w:r>
       <w:r>
         <w:t>Áp dụng kỹ thuật RAG (Retrieval-Augmented Generation) và Fine-tuning LLM dựa trên đề cương và slide bài giảng chính thức của từng trường đại học để tăng độ chính xác của câu hỏi đào sâu.</w:t>
-      </w:r>
-    </w:p>
-    <w:p>
-      <w:r>
-        <w:br w:type="page"/>
       </w:r>
     </w:p>
     <w:p>

</xml_diff>